<commit_message>
Refine portfolio presentation and acknowledgments
</commit_message>
<xml_diff>
--- a/docs/agile-retrospective.docx
+++ b/docs/agile-retrospective.docx
@@ -17,7 +17,7 @@
     </w:p>
     <w:p>
       <w:r>
-        <w:t>This reflection examines a simulated travel application project completed for SNHU CS-250. I wrote from the assigned Scrum Master perspective, considering requirements, changing priorities, communication, and the suitability of Scrum. ChadaTech and SNHU Travel belong to the supplied course scenario. References to a team, pilot, or client describe that simulation, not employment or a commercial delivery.</w:t>
+        <w:t>This reflection examines a simulated travel application project completed as undergraduate coursework. I wrote from the assigned Scrum Master perspective, considering requirements, changing priorities, communication, and the suitability of Scrum. ChadaTech and its travel client belong to the supplied fictional scenario.</w:t>
       </w:r>
     </w:p>
     <w:p>
@@ -71,7 +71,7 @@
     </w:p>
     <w:p>
       <w:r>
-        <w:t>The Tester’s role was to ensure quality and clarity by taking the high-level user stories into measurable acceptance criteria that guided development and validation. As in, user stories often lacked fine detail, but carried intent. The Tester was responsible for turning that intent into testable conditions. With the team’s “definition of done,” tests became shared indicators of completion, because the entire team agreed on what “done” meant. Thus they also were called upon to communicate where gaps and ambiguity existed, as clarity, once received from the Product Owner, improved both the testing and the user stories. This was also seen in the discernment shown to said stories, wherein non-functional requirements and edge cases are often omitted for lack of assumed technical foreknowledge, and still must be found. Agile requires vigilance for this, as in the case of the SNHU Travel user stories where obvious, but unspoken, technical requirements were found in the arrangement of the user profile preference settings. It was not in the user story to include every toggle, reset, and ability to save, yet it was assumed by intent that they should be there.</w:t>
+        <w:t>The Tester’s role was to ensure quality and clarity by taking the high-level user stories into measurable acceptance criteria that guided development and validation. As in, user stories often lacked fine detail, but carried intent. The Tester was responsible for turning that intent into testable conditions. With the team’s “definition of done,” tests became shared indicators of completion, because the entire team agreed on what “done” meant. Thus they also were called upon to communicate where gaps and ambiguity existed, as clarity, once received from the Product Owner, improved both the testing and the user stories. This was also seen in the discernment shown to said stories, wherein non-functional requirements and edge cases are often omitted for lack of assumed technical foreknowledge, and still must be found. Agile requires vigilance for this, as in the case of the travel client user stories where obvious, but unspoken, technical requirements were found in the arrangement of the user profile preference settings. It was not in the user story to include every toggle, reset, and ability to save, yet it was assumed by intent that they should be there.</w:t>
       </w:r>
     </w:p>
     <w:p>
@@ -84,7 +84,7 @@
     </w:p>
     <w:p>
       <w:r>
-        <w:t>The development perspective was to remain focused on Scrum-style implementation while remaining flexible to priority changes. This was a significant departure from waterfall in that change was expected, and treated as good. Their job was to translate stories and acceptance criteria into the actual, working software. Thus every other role helps to support what the Developer creates, and in turn receives what is created to ensure it fits the project’s shape. Developers thus needed to ask precise, thorough questions, to retain the high level communication and avoid situations of rework. During the Daily Scrum, priorities were to be clarified, blockers rooted out, and dependencies coordinated. Because they worked in incremental slices with said practices, pivots were relatively easy to execute because little had been set in stone. For example, when SNHU Travel wished to change focus from top destination vacation packages to wellness retreats, it ultimately fell to the developer to make the change. And because work was done in those small slices, the scenario illustrated how a smaller scope could make revision more manageable. It did not establish a measured implementation cost.</w:t>
+        <w:t>The development perspective was to remain focused on Scrum-style implementation while remaining flexible to priority changes. This was a significant departure from waterfall in that change was expected, and treated as good. Their job was to translate stories and acceptance criteria into the actual, working software. Thus every other role helps to support what the Developer creates, and in turn receives what is created to ensure it fits the project’s shape. Developers thus needed to ask precise, thorough questions, to retain the high level communication and avoid situations of rework. During the Daily Scrum, priorities were to be clarified, blockers rooted out, and dependencies coordinated. Because they worked in incremental slices with said practices, pivots were relatively easy to execute because little had been set in stone. For example, when the travel client wished to change focus from top destination vacation packages to wellness retreats, it ultimately fell to the developer to make the change. And because work was done in those small slices, the scenario illustrated how a smaller scope could make revision more manageable. It did not establish a measured implementation cost.</w:t>
       </w:r>
     </w:p>
     <w:p>
@@ -123,7 +123,7 @@
     </w:p>
     <w:p>
       <w:r>
-        <w:t>Communication was the most commonly referenced element in our pilot run. Every role had duties towards it, and all were focused on avoiding siloing, opacity, and vagueness within the team (including the stakeholders). As examples, the Testers sent clarifying emails to the Product Owner on clarifying acceptance criteria. The Product Owner in turn took those specific questions and gave actionable answers. The Developer emailed the Product Owner and Tester on aligning priorities and technical expectations, and in doing so, bounded their questions and created shared understanding. The original submission included two correspondence images. They are omitted from this edition because their authorship and redistribution status have not been confirmed.</w:t>
+        <w:t>Communication was the most commonly referenced element in our pilot run. Every role had duties towards it, and all were focused on avoiding siloing, opacity, and vagueness within the team (including the stakeholders). As examples, the Testers sent clarifying emails to the Product Owner on clarifying acceptance criteria. The Product Owner in turn took those specific questions and gave actionable answers. The Developer emailed the Product Owner and Tester on aligning priorities and technical expectations, and in doing so, bounded their questions and created shared understanding.</w:t>
       </w:r>
     </w:p>
     <w:p>
@@ -164,7 +164,7 @@
     </w:p>
     <w:p>
       <w:r>
-        <w:t>Evaluating the Scrum/Agile approach for SNHU Travel revealed a number of strengths. First and foremost was the adaptability. Technology needs change often and sometimes dramatically, the AI revolution has occurred only relatively recently, and being locked into a design for years before delivery that cannot bend and twist is to be stagnant while more agile competitors trapeze about. Because work was time-boxed into sprints and driven by the backlog, the scenario illustrated how changes could be considered without revisiting every project decision. Incremental delivery was intended to support early and continuous feedback, avoiding missing stakeholder expectations, and learning more of what exactly they wanted even in the midst of work. There was also the clear separation of responsibility between Scrum roles. The Product Owner was focused on value and priorities, the Scrum Master on cadence and flow, the Developers in implementation, and the Testers on validation, while quality remained a shared responsibility.</w:t>
+        <w:t>Evaluating the Scrum/Agile approach for the travel client revealed a number of strengths. First and foremost was the adaptability. Technology needs change often and sometimes dramatically, the AI revolution has occurred only relatively recently, and being locked into a design for years before delivery that cannot bend and twist is to be stagnant while more agile competitors trapeze about. Because work was time-boxed into sprints and driven by the backlog, the scenario illustrated how changes could be considered without revisiting every project decision. Incremental delivery was intended to support early and continuous feedback, avoiding missing stakeholder expectations, and learning more of what exactly they wanted even in the midst of work. There was also the clear separation of responsibility between Scrum roles. The Product Owner was focused on value and priorities, the Scrum Master on cadence and flow, the Developers in implementation, and the Testers on validation, while quality remained a shared responsibility.</w:t>
       </w:r>
     </w:p>
     <w:p>
@@ -182,17 +182,12 @@
         <w:pStyle w:val="Heading1"/>
       </w:pPr>
       <w:r>
-        <w:t>Portfolio Edition and Reference</w:t>
+        <w:t>Reference</w:t>
       </w:r>
     </w:p>
     <w:p>
       <w:r>
-        <w:t>This edition preserves the substantive reflection and its academic examples, adds headings, corrects conspicuous wording and Scrum terminology, and narrows claims about simulated outcomes. The unverified correspondence screenshots and their captions are omitted. AI assistance was used for portfolio cleanup. The original school submission is preserved separately.</w:t>
-      </w:r>
-    </w:p>
-    <w:p>
-      <w:r>
-        <w:t>Terminology reference added during cleanup: Ken Schwaber and Jeff Sutherland, The Scrum Guide, November 2020. https://scrumguides.org/scrum-guide.html</w:t>
+        <w:t>Ken Schwaber and Jeff Sutherland, The Scrum Guide, November 2020. https://scrumguides.org/scrum-guide.html</w:t>
       </w:r>
     </w:p>
     <w:sectPr>

</xml_diff>